<commit_message>
Update project architecture and passkey documentation
</commit_message>
<xml_diff>
--- a/docs/specifications/Legacy_Fortress_Inclusion_Exclusion_Specification_UPDATED_2026-08-20_v2.docx
+++ b/docs/specifications/Legacy_Fortress_Inclusion_Exclusion_Specification_UPDATED_2026-08-20_v2.docx
@@ -31,7 +31,7 @@
         <w:pStyle w:val="ListBullet"/>
       </w:pPr>
       <w:r>
-        <w:t>Email + password login</w:t>
+        <w:t>Passkey-first account authentication where supported, with email/password and recovery fallback during staged rollout</w:t>
       </w:r>
     </w:p>
     <w:p>
@@ -47,7 +47,7 @@
         <w:pStyle w:val="ListBullet"/>
       </w:pPr>
       <w:r>
-        <w:t>Optional passkey / biometric login (if supported by browser/device)</w:t>
+        <w:t>Platform passkeys may use Face ID, Touch ID/fingerprint, Windows Hello, device PIN or security key; platform biometrics remain on the user device/authenticator</w:t>
       </w:r>
     </w:p>
     <w:p>
@@ -55,7 +55,7 @@
         <w:pStyle w:val="ListBullet"/>
       </w:pPr>
       <w:r>
-        <w:t>Session management &amp; basic security protections (rate limiting, lockout)</w:t>
+        <w:t>Session management, rate limiting, abuse protection and role-aware post-authentication workspace routing</w:t>
       </w:r>
     </w:p>
     <w:p>
@@ -515,21 +515,59 @@
       </w:r>
     </w:p>
     <w:p>
+      <w:pPr>
+        <w:pStyle w:val="Heading2"/>
+      </w:pPr>
       <w:r>
-        <w:br w:type="page"/>
+        <w:t>D. AUTHENTICATION &amp; ASSURANCE UPDATE</w:t>
       </w:r>
     </w:p>
     <w:p>
       <w:pPr>
-        <w:pStyle w:val="Heading1"/>
+        <w:pStyle w:val="ListBullet"/>
       </w:pPr>
       <w:r>
-        <w:t>D. 20 AUGUST 2026 GOVERNANCE ADDENDUM — MANDATORY PLATFORM FOUNDATION</w:t>
+        <w:t>L1 account authentication: passkey preferred, password/recovery fallback during transition.</w:t>
       </w:r>
     </w:p>
     <w:p>
+      <w:pPr>
+        <w:pStyle w:val="ListBullet"/>
+      </w:pPr>
       <w:r>
-        <w:t>This addendum records product and data-protection requirements that supersede any earlier MVP assumption where there is a conflict. It does not assert that these capabilities are already implemented.</w:t>
+        <w:t>L2 identity verification: separate real-world identity process for protected linked access where policy requires it.</w:t>
+      </w:r>
+    </w:p>
+    <w:p>
+      <w:pPr>
+        <w:pStyle w:val="ListBullet"/>
+      </w:pPr>
+      <w:r>
+        <w:t>L3 fresh presence: time-bounded re-authentication for high-risk actions, with passkey/device-presence as the preferred future mechanism where appropriate.</w:t>
+      </w:r>
+    </w:p>
+    <w:p>
+      <w:pPr>
+        <w:pStyle w:val="ListBullet"/>
+      </w:pPr>
+      <w:r>
+        <w:t>Passkey authentication must not be treated as proof of legal authority, executor status, probate authority or access activation.</w:t>
+      </w:r>
+    </w:p>
+    <w:p>
+      <w:pPr>
+        <w:pStyle w:val="ListBullet"/>
+      </w:pPr>
+      <w:r>
+        <w:t>A valid pending invitation or linked-role action should take precedence over generic Personal Vault onboarding after authentication.</w:t>
+      </w:r>
+    </w:p>
+    <w:p>
+      <w:pPr>
+        <w:pStyle w:val="ListBullet"/>
+      </w:pPr>
+      <w:r>
+        <w:t>Users with multiple authorised contexts must be routed to or allowed to choose the correct workspace without silently merging vaults or roles.</w:t>
       </w:r>
     </w:p>
     <w:p>
@@ -537,7 +575,7 @@
         <w:pStyle w:val="Heading2"/>
       </w:pPr>
       <w:r>
-        <w:t>1. People, roles and permissions</w:t>
+        <w:t>E. STAGING-FIRST PASSKEY SCOPE</w:t>
       </w:r>
     </w:p>
     <w:p>
@@ -545,7 +583,7 @@
         <w:pStyle w:val="ListBullet"/>
       </w:pPr>
       <w:r>
-        <w:t>Use one canonical People &amp; Access model across the Personal Vault.</w:t>
+        <w:t>Passkey enrolment/sign-in capability is introduced in staging first and remains feature-gated until self-hosted authentication compatibility is proven.</w:t>
       </w:r>
     </w:p>
     <w:p>
@@ -553,7 +591,7 @@
         <w:pStyle w:val="ListBullet"/>
       </w:pPr>
       <w:r>
-        <w:t>Separate person type (Family/Loved One, Professional Adviser, Other Trusted Person), legal/estate roles (including Beneficiary, Executor, Trustee, Representative/Attorney, Professional Adviser) and permissions.</w:t>
+        <w:t>Password removal is excluded from the current rollout; recovery and unsupported-device fallback must remain available.</w:t>
       </w:r>
     </w:p>
     <w:p>
@@ -561,7 +599,7 @@
         <w:pStyle w:val="ListBullet"/>
       </w:pPr>
       <w:r>
-        <w:t>Allow multiple roles per person.</w:t>
+        <w:t>Production enablement requires hosted browser/device UAT, recovery testing, multi-credential testing, workspace-routing proof, monitoring and rollback planning.</w:t>
       </w:r>
     </w:p>
     <w:p>
@@ -569,23 +607,7 @@
         <w:pStyle w:val="ListBullet"/>
       </w:pPr>
       <w:r>
-        <w:t>Permissions must support view, download and controlled document contribution as distinct grants.</w:t>
-      </w:r>
-    </w:p>
-    <w:p>
-      <w:pPr>
-        <w:pStyle w:val="ListBullet"/>
-      </w:pPr>
-      <w:r>
-        <w:t>Only an eligible Professional Adviser may receive document-contribution permission in the normal pre-death workflow.</w:t>
-      </w:r>
-    </w:p>
-    <w:p>
-      <w:pPr>
-        <w:pStyle w:val="ListBullet"/>
-      </w:pPr>
-      <w:r>
-        <w:t>Document contribution creates a new immutable document/version and must not overwrite a historical original.</w:t>
+        <w:t>Administrative views may expose privacy-safe credential status only; raw credential secrets and device biometric data are excluded.</w:t>
       </w:r>
     </w:p>
     <w:p>
@@ -593,558 +615,27 @@
         <w:pStyle w:val="Heading2"/>
       </w:pPr>
       <w:r>
-        <w:t>2. Invitation and identity verification</w:t>
-      </w:r>
-    </w:p>
-    <w:p>
-      <w:pPr>
-        <w:pStyle w:val="ListBullet"/>
-      </w:pPr>
-      <w:r>
-        <w:t>Invitation acceptance must not by itself grant protected vault access where identity verification is required.</w:t>
-      </w:r>
-    </w:p>
-    <w:p>
-      <w:pPr>
-        <w:pStyle w:val="ListBullet"/>
-      </w:pPr>
-      <w:r>
-        <w:t>Target invitation states: draft, sent, accepted, identity_required, verification_submitted, verified, active, plus delivery_failed/expired/revoked/rejected as applicable.</w:t>
-      </w:r>
-    </w:p>
-    <w:p>
-      <w:pPr>
-        <w:pStyle w:val="ListBullet"/>
-      </w:pPr>
-      <w:r>
-        <w:t>Photo-ID plus camera facial/liveness matching is identity verification and biometric recognition, distinct from optional device/passkey biometric login.</w:t>
-      </w:r>
-    </w:p>
-    <w:p>
-      <w:pPr>
-        <w:pStyle w:val="ListBullet"/>
-      </w:pPr>
-      <w:r>
-        <w:t>Biometric recognition requires approved privacy governance, including a DPIA, lawful basis, Article 9 special-category condition, provider/controller/processor analysis, retention rules and manual exception handling before production use.</w:t>
-      </w:r>
-    </w:p>
-    <w:p>
-      <w:pPr>
-        <w:pStyle w:val="ListBullet"/>
-      </w:pPr>
-      <w:r>
-        <w:t>Access restrictions must be server/API/database/RLS enforced.</w:t>
-      </w:r>
-    </w:p>
-    <w:p>
-      <w:pPr>
-        <w:pStyle w:val="Heading2"/>
-      </w:pPr>
-      <w:r>
-        <w:t>3. Estate access after death</w:t>
-      </w:r>
-    </w:p>
-    <w:p>
-      <w:pPr>
-        <w:pStyle w:val="ListBullet"/>
-      </w:pPr>
-      <w:r>
-        <w:t>Estate access is a separate workflow requiring claimant authentication/re-verification, death certificate, probate/authority evidence where applicable and Legacy Fortress administrative review.</w:t>
-      </w:r>
-    </w:p>
-    <w:p>
-      <w:pPr>
-        <w:pStyle w:val="ListBullet"/>
-      </w:pPr>
-      <w:r>
-        <w:t>Admin decision must be auditable with claimant, evidence references, decision, reason, administrator and timestamp.</w:t>
-      </w:r>
-    </w:p>
-    <w:p>
-      <w:pPr>
-        <w:pStyle w:val="ListBullet"/>
-      </w:pPr>
-      <w:r>
-        <w:t>Approved estate access must not permit overwrite or deletion of the deceased wallet holder’s historic original documents.</w:t>
-      </w:r>
-    </w:p>
-    <w:p>
-      <w:pPr>
-        <w:pStyle w:val="ListBullet"/>
-      </w:pPr>
-      <w:r>
-        <w:t>Post-death evidence must be stored separately with provenance.</w:t>
-      </w:r>
-    </w:p>
-    <w:p>
-      <w:pPr>
-        <w:pStyle w:val="Heading2"/>
-      </w:pPr>
-      <w:r>
-        <w:t>4. Enterprise licensing and sponsored customers</w:t>
-      </w:r>
-    </w:p>
-    <w:p>
-      <w:pPr>
-        <w:pStyle w:val="ListBullet"/>
-      </w:pPr>
-      <w:r>
-        <w:t>A sponsored customer remains a Legacy Fortress user/customer and wallet holder; the sponsor funds an entitlement but does not own the wallet.</w:t>
-      </w:r>
-    </w:p>
-    <w:p>
-      <w:pPr>
-        <w:pStyle w:val="ListBullet"/>
-      </w:pPr>
-      <w:r>
-        <w:t>Canonical relationship target: Organisation -&gt; Licence/Contract -&gt; Registration Campaign -&gt; Sponsored Entitlement -&gt; Legacy Fortress User/Wallet.</w:t>
-      </w:r>
-    </w:p>
-    <w:p>
-      <w:pPr>
-        <w:pStyle w:val="ListBullet"/>
-      </w:pPr>
-      <w:r>
-        <w:t>Partner dashboards must be purpose-limited and data-minimised. Sponsorship alone does not grant access to wills, financial documents, beneficiary details, notes or other protected vault content.</w:t>
-      </w:r>
-    </w:p>
-    <w:p>
-      <w:pPr>
-        <w:pStyle w:val="ListBullet"/>
-      </w:pPr>
-      <w:r>
-        <w:t>Analytics eligibility and marketing eligibility are separate.</w:t>
-      </w:r>
-    </w:p>
-    <w:p>
-      <w:pPr>
-        <w:pStyle w:val="Heading2"/>
-      </w:pPr>
-      <w:r>
-        <w:t>5. UK GDPR administration</w:t>
-      </w:r>
-    </w:p>
-    <w:p>
-      <w:pPr>
-        <w:pStyle w:val="ListBullet"/>
-      </w:pPr>
-      <w:r>
-        <w:t>Legacy Fortress Admin must support case management for access/SAR, rectification, erasure, restriction, portability, objection, consent withdrawal and privacy enquiries.</w:t>
-      </w:r>
-    </w:p>
-    <w:p>
-      <w:pPr>
-        <w:pStyle w:val="ListBullet"/>
-      </w:pPr>
-      <w:r>
-        <w:t>Operational workflows must capture received date, calculated due date, requester identity verification, scope, assigned administrator, decision, response date and audit trail.</w:t>
-      </w:r>
-    </w:p>
-    <w:p>
-      <w:pPr>
-        <w:pStyle w:val="ListBullet"/>
-      </w:pPr>
-      <w:r>
-        <w:t>One calendar month is the default operational deadline for applicable individual-rights requests, subject to the applicable legal extension rules.</w:t>
-      </w:r>
-    </w:p>
-    <w:p>
-      <w:pPr>
-        <w:pStyle w:val="ListBullet"/>
-      </w:pPr>
-      <w:r>
-        <w:t>Direct-marketing objections must create immediate suppression from campaign selection/exports.</w:t>
-      </w:r>
-    </w:p>
-    <w:p>
-      <w:pPr>
-        <w:pStyle w:val="ListBullet"/>
-      </w:pPr>
-      <w:r>
-        <w:t>Retention schedules, review dates, deletion/anonymisation, legal holds/exceptions and backup-expiry handling must be implemented and auditable.</w:t>
-      </w:r>
-    </w:p>
-    <w:p>
-      <w:pPr>
-        <w:pStyle w:val="Heading2"/>
-      </w:pPr>
-      <w:r>
-        <w:t>6. Partner data sharing and marketing</w:t>
-      </w:r>
-    </w:p>
-    <w:p>
-      <w:pPr>
-        <w:pStyle w:val="ListBullet"/>
-      </w:pPr>
-      <w:r>
-        <w:t>Service Terms acceptance, privacy notice acceptance/acknowledgement, sponsor relationship, data-sharing purpose, Legacy Fortress marketing and named-partner marketing must be recorded separately as applicable.</w:t>
-      </w:r>
-    </w:p>
-    <w:p>
-      <w:pPr>
-        <w:pStyle w:val="ListBullet"/>
-      </w:pPr>
-      <w:r>
-        <w:t>Do not infer partner direct-marketing permission from general Terms &amp; Conditions.</w:t>
-      </w:r>
-    </w:p>
-    <w:p>
-      <w:pPr>
-        <w:pStyle w:val="ListBullet"/>
-      </w:pPr>
-      <w:r>
-        <w:t>Controller-to-controller sharing must have a documented purpose, lawful basis, data categories, recipient, retention, individual-rights and security position, with a data-sharing agreement or joint-controller arrangement where appropriate.</w:t>
-      </w:r>
-    </w:p>
-    <w:p>
-      <w:pPr>
-        <w:pStyle w:val="ListBullet"/>
-      </w:pPr>
-      <w:r>
-        <w:t>Electronic marketing must comply with PECR as well as UK GDPR; consent/soft-opt-in eligibility must be assessed for the actual sender and relationship.</w:t>
-      </w:r>
-    </w:p>
-    <w:p>
-      <w:pPr>
-        <w:pStyle w:val="Heading2"/>
-      </w:pPr>
-      <w:r>
-        <w:t>7. Release gate</w:t>
+        <w:t>F. CURRENT PASSKEY FOUNDATION - SHA 302377e</w:t>
       </w:r>
     </w:p>
     <w:p>
       <w:r>
-        <w:t>These controls are mandatory production-readiness requirements even where they extend beyond the original MVP list. Development may be staged, but the product must not represent an unimplemented control as functional or compliant.</w:t>
-      </w:r>
-    </w:p>
-    <w:p>
-      <w:pPr>
-        <w:pStyle w:val="Heading2"/>
-      </w:pPr>
-      <w:r>
-        <w:t>ICO sources reviewed</w:t>
-      </w:r>
-    </w:p>
-    <w:p>
-      <w:pPr>
-        <w:pStyle w:val="ListBullet"/>
-      </w:pPr>
-      <w:r>
-        <w:t>UK GDPR guidance and resources — https://ico.org.uk/for-organisations/uk-gdpr-guidance-and-resources/</w:t>
-      </w:r>
-    </w:p>
-    <w:p>
-      <w:pPr>
-        <w:pStyle w:val="ListBullet"/>
-      </w:pPr>
-      <w:r>
-        <w:t>A guide to lawful basis</w:t>
-      </w:r>
-    </w:p>
-    <w:p>
-      <w:pPr>
-        <w:pStyle w:val="ListBullet"/>
-      </w:pPr>
-      <w:r>
-        <w:t>Data sharing: a code of practice (lawful basis, agreements and checklist)</w:t>
-      </w:r>
-    </w:p>
-    <w:p>
-      <w:pPr>
-        <w:pStyle w:val="ListBullet"/>
-      </w:pPr>
-      <w:r>
-        <w:t>Controllers and processors</w:t>
-      </w:r>
-    </w:p>
-    <w:p>
-      <w:pPr>
-        <w:pStyle w:val="ListBullet"/>
-      </w:pPr>
-      <w:r>
-        <w:t>Special category data and biometric recognition guidance</w:t>
-      </w:r>
-    </w:p>
-    <w:p>
-      <w:pPr>
-        <w:pStyle w:val="ListBullet"/>
-      </w:pPr>
-      <w:r>
-        <w:t>Data Protection Impact Assessments (DPIAs)</w:t>
-      </w:r>
-    </w:p>
-    <w:p>
-      <w:pPr>
-        <w:pStyle w:val="ListBullet"/>
-      </w:pPr>
-      <w:r>
-        <w:t>Individual rights and subject access requests</w:t>
-      </w:r>
-    </w:p>
-    <w:p>
-      <w:pPr>
-        <w:pStyle w:val="ListBullet"/>
-      </w:pPr>
-      <w:r>
-        <w:t>Storage limitation and accuracy</w:t>
-      </w:r>
-    </w:p>
-    <w:p>
-      <w:pPr>
-        <w:pStyle w:val="ListBullet"/>
-      </w:pPr>
-      <w:r>
-        <w:t>Integrity and confidentiality (security)</w:t>
-      </w:r>
-    </w:p>
-    <w:p>
-      <w:pPr>
-        <w:pStyle w:val="ListBullet"/>
-      </w:pPr>
-      <w:r>
-        <w:t>Direct marketing / PECR and electronic mail marketing guidance</w:t>
+        <w:t>Included in staging foundation: role-aware post-authentication routing improvements; non-production passkey enrollment foundation; browser capability detection; safe fallback messaging; account Security passkey enrollment UI; privacy wording that platform biometrics remain local to the device/authenticator; password fallback.</w:t>
       </w:r>
     </w:p>
     <w:p>
       <w:r>
-        <w:t>Review note: several ICO guidance pages state that they are under review following the Data (Use and Access) Act. Re-check current ICO guidance and obtain formal privacy/legal approval before production release of biometric recognition, partner data sharing and partner marketing.</w:t>
-      </w:r>
-    </w:p>
-    <w:p>
-      <w:pPr>
-        <w:pStyle w:val="Heading1"/>
-      </w:pPr>
-      <w:r>
-        <w:t>E. 20 AUGUST 2026 SECURITY &amp; ESTATE-LOCK ADDENDUM</w:t>
+        <w:t>Not yet included as an active product sign-in method: passwordless/discoverable passkey login. The current @supabase/supabase-js 2.98.0 WebAuthn surface supports MFA enrollment/step-up helpers but not the supported passwordless/discoverable sign-in API required for the intended primary passkey experience.</w:t>
       </w:r>
     </w:p>
     <w:p>
       <w:r>
-        <w:t>This addendum extends and supersedes earlier assumptions where required. It records approved target behaviour and does not assert that the current repository already implements it.</w:t>
+        <w:t>Production enablement remains excluded until self-hosted Auth compatibility, hosted browser/device UAT, recovery, multi-credential behaviour, wrong-account invitation handling and rollback are proven.</w:t>
       </w:r>
     </w:p>
     <w:p>
-      <w:pPr>
-        <w:pStyle w:val="Heading2"/>
-      </w:pPr>
       <w:r>
-        <w:t>1. Progressive consent and partner communications</w:t>
-      </w:r>
-    </w:p>
-    <w:p>
-      <w:pPr>
-        <w:pStyle w:val="ListBullet"/>
-      </w:pPr>
-      <w:r>
-        <w:t>Do not overload onboarding with optional consent. Obtain consent/preferences when required and at the point the relevant optional or high-risk purpose arises, with a concise explanation of user benefit.</w:t>
-      </w:r>
-    </w:p>
-    <w:p>
-      <w:pPr>
-        <w:pStyle w:val="ListBullet"/>
-      </w:pPr>
-      <w:r>
-        <w:t>Record service processing, sponsor relationship, Legacy Fortress marketing, named-partner marketing, permitted topic/purpose, channel and communication frequency separately where applicable.</w:t>
-      </w:r>
-    </w:p>
-    <w:p>
-      <w:pPr>
-        <w:pStyle w:val="ListBullet"/>
-      </w:pPr>
-      <w:r>
-        <w:t>Sponsorship must never imply blanket marketing permission. Partner communications must respect the user-selected purpose/channel/frequency and immediate suppression/withdrawal state.</w:t>
-      </w:r>
-    </w:p>
-    <w:p>
-      <w:pPr>
-        <w:pStyle w:val="ListBullet"/>
-      </w:pPr>
-      <w:r>
-        <w:t>Prefer closed-loop partner activation in which Legacy Fortress selects eligible recipients and delivers approved communications without providing an unrestricted customer identity list.</w:t>
-      </w:r>
-    </w:p>
-    <w:p>
-      <w:pPr>
-        <w:pStyle w:val="Heading2"/>
-      </w:pPr>
-      <w:r>
-        <w:t>2. Risk-based identity verification</w:t>
-      </w:r>
-    </w:p>
-    <w:p>
-      <w:pPr>
-        <w:pStyle w:val="ListBullet"/>
-      </w:pPr>
-      <w:r>
-        <w:t>Level 1: authenticated account/session.</w:t>
-      </w:r>
-    </w:p>
-    <w:p>
-      <w:pPr>
-        <w:pStyle w:val="ListBullet"/>
-      </w:pPr>
-      <w:r>
-        <w:t>Level 2: identity verified using photo-ID plus a 1:1 live camera/selfie match under the approved identity-verification workflow.</w:t>
-      </w:r>
-    </w:p>
-    <w:p>
-      <w:pPr>
-        <w:pStyle w:val="ListBullet"/>
-      </w:pPr>
-      <w:r>
-        <w:t>Level 3: presence re-verified using a fresh camera/liveness challenge and 1:1 comparison immediately before a high-risk action.</w:t>
-      </w:r>
-    </w:p>
-    <w:p>
-      <w:pPr>
-        <w:pStyle w:val="ListBullet"/>
-      </w:pPr>
-      <w:r>
-        <w:t>High-risk permission changes, executor/trustee/representative changes and estate/death claims must use server-enforced step-up verification at the policy-defined level.</w:t>
-      </w:r>
-    </w:p>
-    <w:p>
-      <w:pPr>
-        <w:pStyle w:val="ListBullet"/>
-      </w:pPr>
-      <w:r>
-        <w:t>Identity verification must use a provider abstraction. An internal experimental verifier may be used in controlled development/UAT but must be distinguishable from production assurance and must not be represented as official document-authenticity certification.</w:t>
-      </w:r>
-    </w:p>
-    <w:p>
-      <w:pPr>
-        <w:pStyle w:val="Heading2"/>
-      </w:pPr>
-      <w:r>
-        <w:t>3. Death Lock and immutable estate transition</w:t>
-      </w:r>
-    </w:p>
-    <w:p>
-      <w:pPr>
-        <w:pStyle w:val="ListBullet"/>
-      </w:pPr>
-      <w:r>
-        <w:t>Canonical vault lifecycle: OWNER_ACTIVE -&gt; DEATH_REPORTED -&gt; PROTECTIVE_LOCK -&gt; ESTATE_LOCKED.</w:t>
-      </w:r>
-    </w:p>
-    <w:p>
-      <w:pPr>
-        <w:pStyle w:val="ListBullet"/>
-      </w:pPr>
-      <w:r>
-        <w:t>PROTECTIVE_LOCK is a defensive state while the death claim is investigated and must block ordinary mutation without by itself granting estate access.</w:t>
-      </w:r>
-    </w:p>
-    <w:p>
-      <w:pPr>
-        <w:pStyle w:val="ListBullet"/>
-      </w:pPr>
-      <w:r>
-        <w:t>ESTATE_LOCKED makes the deceased owner’s historical vault immutable through normal product workflows.</w:t>
-      </w:r>
-    </w:p>
-    <w:p>
-      <w:pPr>
-        <w:pStyle w:val="ListBullet"/>
-      </w:pPr>
-      <w:r>
-        <w:t>Post-death evidence/administration must be appended in a separate Estate Administration context with full provenance.</w:t>
-      </w:r>
-    </w:p>
-    <w:p>
-      <w:pPr>
-        <w:pStyle w:val="ListBullet"/>
-      </w:pPr>
-      <w:r>
-        <w:t>Representative/claimant access is a separate lifecycle from vault state. Suspending or revoking a compromised executor/representative must leave the deceased vault locked.</w:t>
-      </w:r>
-    </w:p>
-    <w:p>
-      <w:pPr>
-        <w:pStyle w:val="ListBullet"/>
-      </w:pPr>
-      <w:r>
-        <w:t>An emergency Suspend Estate Access action must block estate sessions, downloads, key/decrypt release and new estate additions while preserving evidence and the lock.</w:t>
-      </w:r>
-    </w:p>
-    <w:p>
-      <w:pPr>
-        <w:pStyle w:val="Heading2"/>
-      </w:pPr>
-      <w:r>
-        <w:t>4. False or malicious death report recovery</w:t>
-      </w:r>
-    </w:p>
-    <w:p>
-      <w:pPr>
-        <w:pStyle w:val="ListBullet"/>
-      </w:pPr>
-      <w:r>
-        <w:t>Exceptional path: DEATH_STATUS_DISPUTED -&gt; OWNER_RECOVERY -&gt; OWNER_ACTIVE.</w:t>
-      </w:r>
-    </w:p>
-    <w:p>
-      <w:pPr>
-        <w:pStyle w:val="ListBullet"/>
-      </w:pPr>
-      <w:r>
-        <w:t>Recovery must require a security case, suspension of claimant access, fresh high-assurance identity/presence verification, investigation, dual authorised Legacy Fortress approval and immutable audit evidence.</w:t>
-      </w:r>
-    </w:p>
-    <w:p>
-      <w:pPr>
-        <w:pStyle w:val="ListBullet"/>
-      </w:pPr>
-      <w:r>
-        <w:t>Reinstating a living owner must never be an ordinary single-admin unlock toggle.</w:t>
-      </w:r>
-    </w:p>
-    <w:p>
-      <w:pPr>
-        <w:pStyle w:val="ListBullet"/>
-      </w:pPr>
-      <w:r>
-        <w:t>Recovery must preserve forensic/audit records of the false or malicious death event and any attempted estate access.</w:t>
-      </w:r>
-    </w:p>
-    <w:p>
-      <w:pPr>
-        <w:pStyle w:val="Heading2"/>
-      </w:pPr>
-      <w:r>
-        <w:t>5. Encryption and recovery target</w:t>
-      </w:r>
-    </w:p>
-    <w:p>
-      <w:pPr>
-        <w:pStyle w:val="ListBullet"/>
-      </w:pPr>
-      <w:r>
-        <w:t>Target envelope encryption: user/vault data encrypted with data-encryption keys, with those keys wrapped by separately protected key-encryption/recovery material.</w:t>
-      </w:r>
-    </w:p>
-    <w:p>
-      <w:pPr>
-        <w:pStyle w:val="ListBullet"/>
-      </w:pPr>
-      <w:r>
-        <w:t>Usable recovery keys must not be stored in the same ordinary security boundary as encrypted application data.</w:t>
-      </w:r>
-    </w:p>
-    <w:p>
-      <w:pPr>
-        <w:pStyle w:val="ListBullet"/>
-      </w:pPr>
-      <w:r>
-        <w:t>Estate recovery should use separately protected wrapped recovery material, least privilege, dual control and audited key release, preferably through managed KMS/HSM or equivalent controls.</w:t>
-      </w:r>
-    </w:p>
-    <w:p>
-      <w:pPr>
-        <w:pStyle w:val="ListBullet"/>
-      </w:pPr>
-      <w:r>
-        <w:t>A scheduled reconciliation may verify that every active vault has valid recovery material, but recoverability must not depend on a weekly plaintext-key export.</w:t>
+        <w:t>Passkey authentication remains L1 account authentication. It does not replace L2 government-ID/liveness identity verification where required and does not establish executor authority, probate authority or access activation.</w:t>
       </w:r>
     </w:p>
     <w:sectPr>

</xml_diff>